<commit_message>
docs(product): embed both sprint diagrams into SPRINT_PLAN_LINGUAL_MCS2026.docx
</commit_message>
<xml_diff>
--- a/docs/product/SPRINT_PLAN_LINGUAL_MCS2026.docx
+++ b/docs/product/SPRINT_PLAN_LINGUAL_MCS2026.docx
@@ -1379,7 +1379,7 @@
           <w:sz w:val="18"/>
           <w:szCs w:val="18"/>
         </w:rPr>
-        <w:t xml:space="preserve">Hình: Sơ đồ Lộ trình 10 Tuần &amp; Phân bổ 3 Luồng Phát triển Song song của LINGUAL (MCS 2026)</w:t>
+        <w:t xml:space="preserve">Hình: Sơ đồ Lộ trình 10 Tuần &amp; 4 Sprint Phát triển Dự án LINGUAL (MCS 2026)</w:t>
       </w:r>
     </w:p>
     <w:p>
@@ -1409,30 +1409,63 @@
     </w:p>
     <w:p>
       <w:pPr>
-        <w:spacing w:after="60" w:before="60" w:line="260"/>
+        <w:spacing w:after="100" w:before="180"/>
+        <w:jc w:val="center"/>
       </w:pPr>
       <w:r>
-        <w:rPr>
-          <w:rFonts w:ascii="Calibri" w:cs="Calibri" w:eastAsia="Calibri" w:hAnsi="Calibri"/>
-          <w:color w:val="2D3748"/>
-          <w:sz w:val="21"/>
-          <w:szCs w:val="21"/>
-        </w:rPr>
-        <w:t xml:space="preserve">!Sơ đồ Ma trận 3 Luồng Phát triển Song song &amp; Lộ trình 10 Tuần</w:t>
+        <w:drawing>
+          <wp:inline distT="0" distB="0" distL="0" distR="0">
+            <wp:extent cx="5524500" cy="1543050"/>
+            <wp:effectExtent t="0" r="0" b="0" l="0"/>
+            <wp:docPr id="1" name="" descr="" title=""/>
+            <wp:cNvGraphicFramePr>
+              <a:graphicFrameLocks xmlns:a="http://schemas.openxmlformats.org/drawingml/2006/main" noChangeAspect="1"/>
+            </wp:cNvGraphicFramePr>
+            <a:graphic xmlns:a="http://schemas.openxmlformats.org/drawingml/2006/main">
+              <a:graphicData uri="http://schemas.openxmlformats.org/drawingml/2006/picture">
+                <pic:pic xmlns:pic="http://schemas.openxmlformats.org/drawingml/2006/picture">
+                  <pic:nvPicPr>
+                    <pic:cNvPr id="0" name="" descr=""/>
+                    <pic:cNvPicPr>
+                      <a:picLocks noChangeAspect="1" noChangeArrowheads="1"/>
+                    </pic:cNvPicPr>
+                  </pic:nvPicPr>
+                  <pic:blipFill>
+                    <a:blip r:embed="rId10" cstate="none"/>
+                    <a:srcRect/>
+                    <a:stretch>
+                      <a:fillRect/>
+                    </a:stretch>
+                  </pic:blipFill>
+                  <pic:spPr bwMode="auto">
+                    <a:xfrm>
+                      <a:off x="0" y="0"/>
+                      <a:ext cx="5524500" cy="1543050"/>
+                    </a:xfrm>
+                    <a:prstGeom prst="rect">
+                      <a:avLst/>
+                    </a:prstGeom>
+                  </pic:spPr>
+                </pic:pic>
+              </a:graphicData>
+            </a:graphic>
+          </wp:inline>
+        </w:drawing>
       </w:r>
     </w:p>
     <w:p>
       <w:pPr>
-        <w:spacing w:after="60" w:before="60" w:line="260"/>
+        <w:spacing w:after="200" w:before="0"/>
+        <w:jc w:val="center"/>
       </w:pPr>
       <w:r>
         <w:rPr>
           <w:rFonts w:ascii="Calibri" w:cs="Calibri" w:eastAsia="Calibri" w:hAnsi="Calibri"/>
           <w:i/>
           <w:iCs/>
-          <w:color w:val="2D3748"/>
-          <w:sz w:val="21"/>
-          <w:szCs w:val="21"/>
+          <w:color w:val="718096"/>
+          <w:sz w:val="18"/>
+          <w:szCs w:val="18"/>
         </w:rPr>
         <w:t xml:space="preserve">Hình: Ma trận 3 Luồng Phát triển Song song &amp; Lộ trình 10 Tuần của LINGUAL (MCS 2026)</w:t>
       </w:r>

</xml_diff>